<commit_message>
Se actulizo los datos de cv de kevin y margarita
</commit_message>
<xml_diff>
--- a/kevin.docx
+++ b/kevin.docx
@@ -4,6 +4,7 @@
   <w:body>
     <w:p>
       <w:pPr>
+        <w:spacing w:line="360" w:lineRule="auto"/>
         <w:rPr>
           <w:lang w:val="es-ES"/>
         </w:rPr>
@@ -12,11 +13,18 @@
         <w:rPr>
           <w:lang w:val="es-ES"/>
         </w:rPr>
-        <w:t>Cv: Kevin Josué Aguilar Gordillo</w:t>
+        <w:t>C</w:t>
+      </w:r>
+      <w:r>
+        <w:rPr>
+          <w:lang w:val="es-ES"/>
+        </w:rPr>
+        <w:t>urriculum Vitae</w:t>
       </w:r>
     </w:p>
     <w:p>
       <w:pPr>
+        <w:spacing w:line="360" w:lineRule="auto"/>
         <w:rPr>
           <w:lang w:val="es-ES"/>
         </w:rPr>
@@ -25,14 +33,39 @@
         <w:rPr>
           <w:lang w:val="es-ES"/>
         </w:rPr>
-        <w:t>Carrera: Desarrollo de Software</w:t>
+        <w:t>Kevin Josué Aguilar Gordillo</w:t>
+      </w:r>
+    </w:p>
+    <w:p>
+      <w:pPr>
+        <w:spacing w:line="360" w:lineRule="auto"/>
+        <w:rPr>
+          <w:lang w:val="es-ES"/>
+        </w:rPr>
+      </w:pPr>
+      <w:r>
+        <w:rPr>
+          <w:lang w:val="es-ES"/>
+        </w:rPr>
+        <w:t>Desarrollo de Software</w:t>
       </w:r>
       <w:r>
         <w:rPr>
           <w:lang w:val="es-ES"/>
         </w:rPr>
         <w:br/>
-        <w:t>Universidad: Tecnologica de la Selva</w:t>
+      </w:r>
+      <w:r>
+        <w:rPr>
+          <w:lang w:val="es-ES"/>
+        </w:rPr>
+        <w:t>Universidad Tecnológica</w:t>
+      </w:r>
+      <w:r>
+        <w:rPr>
+          <w:lang w:val="es-ES"/>
+        </w:rPr>
+        <w:t xml:space="preserve"> de la Selva</w:t>
       </w:r>
       <w:r>
         <w:rPr>

</xml_diff>